<commit_message>
Refine image grading and paper limitations
</commit_message>
<xml_diff>
--- a/paper/main.docx
+++ b/paper/main.docx
@@ -125,7 +125,7 @@
           <w:b w:val="0"/>
           <w:sz w:val="24"/>
         </w:rPr>
-        <w:t>针对 2026 年第八届中青杯数学建模竞赛 B 题，本文围绕 AI 生成图像和视频的质量评价建立无参考评价模型。首先将图像质量分解为语义保真度代理、技术质量、结构完整性和视觉表达四类指标，构造 Laplacian 清晰度、自然场景统计质量、伪影风险、边缘连续性、形状规则性、亮度均衡、色彩丰富度和构图代理等可计算指标。其次采用 AHP、熵权法和 CRITIC 法组合赋权，并利用 TOPSIS 与灰色关联分析得到图像综合质量分。为避免分辨率、边缘复杂度等数量指标造成虚高，进一步引入有效性门控和风险惩罚，得到最终质量指数。最后针对附件 2 的车流视频，建立基于 Farneback 光流连续性、颜色直方图一致性和亮度突变的时序质量模型。</w:t>
+        <w:t>针对 2026 年第八届中青杯数学建模竞赛 B 题，本文围绕 AI 生成图像和视频的质量评价建立无参考评价模型。首先将图像质量分解为语义结构完整性代理、技术质量、结构完整性和视觉表达四类指标，构造 Laplacian 清晰度、自然场景统计质量、伪影风险、边缘连续性、形状规则性、亮度均衡、色彩丰富度和构图代理等可计算指标。其次采用 AHP、熵权法和 CRITIC 法组合赋权，并利用 TOPSIS 与灰色关联分析得到图像综合质量分。为避免分辨率、边缘复杂度等数量指标造成虚高，进一步引入有效性门控和风险惩罚，得到最终质量指数。最后针对附件 2 的车流视频，建立基于 Farneback 光流连续性、颜色直方图一致性和亮度突变的时序质量模型。</w:t>
       </w:r>
     </w:p>
     <w:p>
@@ -138,7 +138,7 @@
           <w:b w:val="0"/>
           <w:sz w:val="24"/>
         </w:rPr>
-        <w:t>附件 1 的 8 张图像中，综合质量最高样本为 5.jpg，最终分为 62.23；最低样本为 3.png，最终分为 42.41。附件 2 视频时序质量分为 81.37，模型判断时序失稳标记为 否。由于附件未提供原始提示词、专家评分和真实生成参数，本文所有等级均为指标体系综合等级，不解释为专家标签；参数优化部分仅给出不适用审计和可观测代理敏感性分析。</w:t>
+        <w:t>附件 1 的 8 张图像中，综合质量最高样本为 5.jpg，最终分为 62.23；最低样本为 3.png，最终分为 42.41。为回应题面高/中/低质量覆盖要求，本文同时给出固定阈值绝对等级和附件内部相对三档等级；相对等级只表示本批 8 张图像内部排序，不解释为专家标签。附件 2 视频时序质量分为 81.37，模型判断时序失稳标记为 否。由于附件未提供原始提示词、专家评分和真实生成参数，参数优化部分仅给出不适用审计和可观测代理敏感性分析。</w:t>
       </w:r>
     </w:p>
     <w:p>
@@ -177,7 +177,7 @@
           <w:b w:val="0"/>
           <w:sz w:val="24"/>
         </w:rPr>
-        <w:t>B 题要求建立 AI 生成内容质量评价模型。问题一要求建立无参考图像质量评价数学模型，包含语义保真度、技术质量和结构完整性等指标；问题二要求对附件 1 的 8 张 AI 生成图像进行评估，并分析内容类型对指标敏感性的影响；问题三要求建立视频时序质量模型，考虑光流连续性、内容一致性、闪烁检测以及时序失稳条件，并分析附件 2 的车流视频。</w:t>
+        <w:t>B 题要求建立 AI 生成内容质量评价模型。问题一要求建立无参考图像质量评价数学模型，题面强调提示词语义保真度、技术质量和结构完整性等指标；问题二要求对附件 1 的 8 张 AI 生成图像进行评估，并分析内容类型对指标敏感性的影响；问题三要求建立视频时序质量模型，考虑光流连续性、内容一致性、闪烁检测以及时序失稳条件，并分析附件 2 的车流视频。</w:t>
       </w:r>
     </w:p>
     <w:p>
@@ -282,7 +282,7 @@
           <w:b w:val="0"/>
           <w:sz w:val="24"/>
         </w:rPr>
-        <w:t>1. 附件未给出原始提示词，语义保真度计算使用可视内容结构化描述作为代理。</w:t>
+        <w:t>1. 附件未给出原始提示词，本文不计算真实 prompt-image 保真度，只计算语义结构完整性代理。</w:t>
       </w:r>
     </w:p>
     <w:p>
@@ -348,7 +348,7 @@
           <w:b w:val="0"/>
           <w:sz w:val="21"/>
         </w:rPr>
-        <w:t>表 1 论文正文表格</w:t>
+        <w:t>表 1 符号说明</w:t>
       </w:r>
     </w:p>
     <w:tbl>
@@ -700,7 +700,7 @@
           <w:b w:val="0"/>
           <w:sz w:val="21"/>
         </w:rPr>
-        <w:t>表 2 论文正文表格</w:t>
+        <w:t>表 2 附件1图像质量评分结果</w:t>
       </w:r>
     </w:p>
     <w:tbl>
@@ -710,16 +710,17 @@
         <w:tblLook w:firstColumn="1" w:firstRow="1" w:lastColumn="0" w:lastRow="0" w:noHBand="0" w:noVBand="1" w:val="04A0"/>
       </w:tblPr>
       <w:tblGrid>
-        <w:gridCol w:w="1814"/>
-        <w:gridCol w:w="1814"/>
-        <w:gridCol w:w="1814"/>
-        <w:gridCol w:w="1814"/>
-        <w:gridCol w:w="1814"/>
+        <w:gridCol w:w="1512"/>
+        <w:gridCol w:w="1512"/>
+        <w:gridCol w:w="1512"/>
+        <w:gridCol w:w="1512"/>
+        <w:gridCol w:w="1512"/>
+        <w:gridCol w:w="1512"/>
       </w:tblGrid>
       <w:tr>
         <w:tc>
           <w:tcPr>
-            <w:tcW w:type="dxa" w:w="1814"/>
+            <w:tcW w:type="dxa" w:w="1512"/>
           </w:tcPr>
           <w:p>
             <w:r>
@@ -734,7 +735,7 @@
         </w:tc>
         <w:tc>
           <w:tcPr>
-            <w:tcW w:type="dxa" w:w="1814"/>
+            <w:tcW w:type="dxa" w:w="1512"/>
           </w:tcPr>
           <w:p>
             <w:r>
@@ -749,7 +750,7 @@
         </w:tc>
         <w:tc>
           <w:tcPr>
-            <w:tcW w:type="dxa" w:w="1814"/>
+            <w:tcW w:type="dxa" w:w="1512"/>
           </w:tcPr>
           <w:p>
             <w:r>
@@ -764,7 +765,7 @@
         </w:tc>
         <w:tc>
           <w:tcPr>
-            <w:tcW w:type="dxa" w:w="1814"/>
+            <w:tcW w:type="dxa" w:w="1512"/>
           </w:tcPr>
           <w:p>
             <w:r>
@@ -779,7 +780,7 @@
         </w:tc>
         <w:tc>
           <w:tcPr>
-            <w:tcW w:type="dxa" w:w="1814"/>
+            <w:tcW w:type="dxa" w:w="1512"/>
           </w:tcPr>
           <w:p>
             <w:r>
@@ -788,7 +789,22 @@
                 <w:b/>
                 <w:sz w:val="19"/>
               </w:rPr>
-              <w:t>等级</w:t>
+              <w:t>绝对等级</w:t>
+            </w:r>
+          </w:p>
+        </w:tc>
+        <w:tc>
+          <w:tcPr>
+            <w:tcW w:type="dxa" w:w="1512"/>
+          </w:tcPr>
+          <w:p>
+            <w:r>
+              <w:rPr>
+                <w:rFonts w:ascii="宋体" w:hAnsi="宋体" w:eastAsia="宋体"/>
+                <w:b/>
+                <w:sz w:val="19"/>
+              </w:rPr>
+              <w:t>相对等级</w:t>
             </w:r>
           </w:p>
         </w:tc>
@@ -796,7 +812,7 @@
       <w:tr>
         <w:tc>
           <w:tcPr>
-            <w:tcW w:type="dxa" w:w="1814"/>
+            <w:tcW w:type="dxa" w:w="1512"/>
           </w:tcPr>
           <w:p>
             <w:r>
@@ -811,7 +827,7 @@
         </w:tc>
         <w:tc>
           <w:tcPr>
-            <w:tcW w:type="dxa" w:w="1814"/>
+            <w:tcW w:type="dxa" w:w="1512"/>
           </w:tcPr>
           <w:p>
             <w:r>
@@ -826,7 +842,7 @@
         </w:tc>
         <w:tc>
           <w:tcPr>
-            <w:tcW w:type="dxa" w:w="1814"/>
+            <w:tcW w:type="dxa" w:w="1512"/>
           </w:tcPr>
           <w:p>
             <w:r>
@@ -841,7 +857,7 @@
         </w:tc>
         <w:tc>
           <w:tcPr>
-            <w:tcW w:type="dxa" w:w="1814"/>
+            <w:tcW w:type="dxa" w:w="1512"/>
           </w:tcPr>
           <w:p>
             <w:r>
@@ -856,7 +872,7 @@
         </w:tc>
         <w:tc>
           <w:tcPr>
-            <w:tcW w:type="dxa" w:w="1814"/>
+            <w:tcW w:type="dxa" w:w="1512"/>
           </w:tcPr>
           <w:p>
             <w:r>
@@ -869,11 +885,26 @@
             </w:r>
           </w:p>
         </w:tc>
+        <w:tc>
+          <w:tcPr>
+            <w:tcW w:type="dxa" w:w="1512"/>
+          </w:tcPr>
+          <w:p>
+            <w:r>
+              <w:rPr>
+                <w:rFonts w:ascii="宋体" w:hAnsi="宋体" w:eastAsia="宋体"/>
+                <w:b w:val="0"/>
+                <w:sz w:val="19"/>
+              </w:rPr>
+              <w:t>相对高</w:t>
+            </w:r>
+          </w:p>
+        </w:tc>
       </w:tr>
       <w:tr>
         <w:tc>
           <w:tcPr>
-            <w:tcW w:type="dxa" w:w="1814"/>
+            <w:tcW w:type="dxa" w:w="1512"/>
           </w:tcPr>
           <w:p>
             <w:r>
@@ -888,7 +919,7 @@
         </w:tc>
         <w:tc>
           <w:tcPr>
-            <w:tcW w:type="dxa" w:w="1814"/>
+            <w:tcW w:type="dxa" w:w="1512"/>
           </w:tcPr>
           <w:p>
             <w:r>
@@ -903,7 +934,7 @@
         </w:tc>
         <w:tc>
           <w:tcPr>
-            <w:tcW w:type="dxa" w:w="1814"/>
+            <w:tcW w:type="dxa" w:w="1512"/>
           </w:tcPr>
           <w:p>
             <w:r>
@@ -918,7 +949,7 @@
         </w:tc>
         <w:tc>
           <w:tcPr>
-            <w:tcW w:type="dxa" w:w="1814"/>
+            <w:tcW w:type="dxa" w:w="1512"/>
           </w:tcPr>
           <w:p>
             <w:r>
@@ -933,7 +964,7 @@
         </w:tc>
         <w:tc>
           <w:tcPr>
-            <w:tcW w:type="dxa" w:w="1814"/>
+            <w:tcW w:type="dxa" w:w="1512"/>
           </w:tcPr>
           <w:p>
             <w:r>
@@ -946,11 +977,26 @@
             </w:r>
           </w:p>
         </w:tc>
+        <w:tc>
+          <w:tcPr>
+            <w:tcW w:type="dxa" w:w="1512"/>
+          </w:tcPr>
+          <w:p>
+            <w:r>
+              <w:rPr>
+                <w:rFonts w:ascii="宋体" w:hAnsi="宋体" w:eastAsia="宋体"/>
+                <w:b w:val="0"/>
+                <w:sz w:val="19"/>
+              </w:rPr>
+              <w:t>相对高</w:t>
+            </w:r>
+          </w:p>
+        </w:tc>
       </w:tr>
       <w:tr>
         <w:tc>
           <w:tcPr>
-            <w:tcW w:type="dxa" w:w="1814"/>
+            <w:tcW w:type="dxa" w:w="1512"/>
           </w:tcPr>
           <w:p>
             <w:r>
@@ -965,7 +1011,7 @@
         </w:tc>
         <w:tc>
           <w:tcPr>
-            <w:tcW w:type="dxa" w:w="1814"/>
+            <w:tcW w:type="dxa" w:w="1512"/>
           </w:tcPr>
           <w:p>
             <w:r>
@@ -980,7 +1026,7 @@
         </w:tc>
         <w:tc>
           <w:tcPr>
-            <w:tcW w:type="dxa" w:w="1814"/>
+            <w:tcW w:type="dxa" w:w="1512"/>
           </w:tcPr>
           <w:p>
             <w:r>
@@ -995,7 +1041,7 @@
         </w:tc>
         <w:tc>
           <w:tcPr>
-            <w:tcW w:type="dxa" w:w="1814"/>
+            <w:tcW w:type="dxa" w:w="1512"/>
           </w:tcPr>
           <w:p>
             <w:r>
@@ -1010,7 +1056,7 @@
         </w:tc>
         <w:tc>
           <w:tcPr>
-            <w:tcW w:type="dxa" w:w="1814"/>
+            <w:tcW w:type="dxa" w:w="1512"/>
           </w:tcPr>
           <w:p>
             <w:r>
@@ -1023,11 +1069,26 @@
             </w:r>
           </w:p>
         </w:tc>
+        <w:tc>
+          <w:tcPr>
+            <w:tcW w:type="dxa" w:w="1512"/>
+          </w:tcPr>
+          <w:p>
+            <w:r>
+              <w:rPr>
+                <w:rFonts w:ascii="宋体" w:hAnsi="宋体" w:eastAsia="宋体"/>
+                <w:b w:val="0"/>
+                <w:sz w:val="19"/>
+              </w:rPr>
+              <w:t>相对中</w:t>
+            </w:r>
+          </w:p>
+        </w:tc>
       </w:tr>
       <w:tr>
         <w:tc>
           <w:tcPr>
-            <w:tcW w:type="dxa" w:w="1814"/>
+            <w:tcW w:type="dxa" w:w="1512"/>
           </w:tcPr>
           <w:p>
             <w:r>
@@ -1042,7 +1103,7 @@
         </w:tc>
         <w:tc>
           <w:tcPr>
-            <w:tcW w:type="dxa" w:w="1814"/>
+            <w:tcW w:type="dxa" w:w="1512"/>
           </w:tcPr>
           <w:p>
             <w:r>
@@ -1057,7 +1118,7 @@
         </w:tc>
         <w:tc>
           <w:tcPr>
-            <w:tcW w:type="dxa" w:w="1814"/>
+            <w:tcW w:type="dxa" w:w="1512"/>
           </w:tcPr>
           <w:p>
             <w:r>
@@ -1072,7 +1133,7 @@
         </w:tc>
         <w:tc>
           <w:tcPr>
-            <w:tcW w:type="dxa" w:w="1814"/>
+            <w:tcW w:type="dxa" w:w="1512"/>
           </w:tcPr>
           <w:p>
             <w:r>
@@ -1087,7 +1148,7 @@
         </w:tc>
         <w:tc>
           <w:tcPr>
-            <w:tcW w:type="dxa" w:w="1814"/>
+            <w:tcW w:type="dxa" w:w="1512"/>
           </w:tcPr>
           <w:p>
             <w:r>
@@ -1100,11 +1161,26 @@
             </w:r>
           </w:p>
         </w:tc>
+        <w:tc>
+          <w:tcPr>
+            <w:tcW w:type="dxa" w:w="1512"/>
+          </w:tcPr>
+          <w:p>
+            <w:r>
+              <w:rPr>
+                <w:rFonts w:ascii="宋体" w:hAnsi="宋体" w:eastAsia="宋体"/>
+                <w:b w:val="0"/>
+                <w:sz w:val="19"/>
+              </w:rPr>
+              <w:t>相对中</w:t>
+            </w:r>
+          </w:p>
+        </w:tc>
       </w:tr>
       <w:tr>
         <w:tc>
           <w:tcPr>
-            <w:tcW w:type="dxa" w:w="1814"/>
+            <w:tcW w:type="dxa" w:w="1512"/>
           </w:tcPr>
           <w:p>
             <w:r>
@@ -1119,7 +1195,7 @@
         </w:tc>
         <w:tc>
           <w:tcPr>
-            <w:tcW w:type="dxa" w:w="1814"/>
+            <w:tcW w:type="dxa" w:w="1512"/>
           </w:tcPr>
           <w:p>
             <w:r>
@@ -1134,7 +1210,7 @@
         </w:tc>
         <w:tc>
           <w:tcPr>
-            <w:tcW w:type="dxa" w:w="1814"/>
+            <w:tcW w:type="dxa" w:w="1512"/>
           </w:tcPr>
           <w:p>
             <w:r>
@@ -1149,7 +1225,7 @@
         </w:tc>
         <w:tc>
           <w:tcPr>
-            <w:tcW w:type="dxa" w:w="1814"/>
+            <w:tcW w:type="dxa" w:w="1512"/>
           </w:tcPr>
           <w:p>
             <w:r>
@@ -1164,7 +1240,7 @@
         </w:tc>
         <w:tc>
           <w:tcPr>
-            <w:tcW w:type="dxa" w:w="1814"/>
+            <w:tcW w:type="dxa" w:w="1512"/>
           </w:tcPr>
           <w:p>
             <w:r>
@@ -1177,11 +1253,26 @@
             </w:r>
           </w:p>
         </w:tc>
+        <w:tc>
+          <w:tcPr>
+            <w:tcW w:type="dxa" w:w="1512"/>
+          </w:tcPr>
+          <w:p>
+            <w:r>
+              <w:rPr>
+                <w:rFonts w:ascii="宋体" w:hAnsi="宋体" w:eastAsia="宋体"/>
+                <w:b w:val="0"/>
+                <w:sz w:val="19"/>
+              </w:rPr>
+              <w:t>相对中</w:t>
+            </w:r>
+          </w:p>
+        </w:tc>
       </w:tr>
       <w:tr>
         <w:tc>
           <w:tcPr>
-            <w:tcW w:type="dxa" w:w="1814"/>
+            <w:tcW w:type="dxa" w:w="1512"/>
           </w:tcPr>
           <w:p>
             <w:r>
@@ -1196,7 +1287,7 @@
         </w:tc>
         <w:tc>
           <w:tcPr>
-            <w:tcW w:type="dxa" w:w="1814"/>
+            <w:tcW w:type="dxa" w:w="1512"/>
           </w:tcPr>
           <w:p>
             <w:r>
@@ -1211,7 +1302,7 @@
         </w:tc>
         <w:tc>
           <w:tcPr>
-            <w:tcW w:type="dxa" w:w="1814"/>
+            <w:tcW w:type="dxa" w:w="1512"/>
           </w:tcPr>
           <w:p>
             <w:r>
@@ -1226,7 +1317,7 @@
         </w:tc>
         <w:tc>
           <w:tcPr>
-            <w:tcW w:type="dxa" w:w="1814"/>
+            <w:tcW w:type="dxa" w:w="1512"/>
           </w:tcPr>
           <w:p>
             <w:r>
@@ -1241,7 +1332,7 @@
         </w:tc>
         <w:tc>
           <w:tcPr>
-            <w:tcW w:type="dxa" w:w="1814"/>
+            <w:tcW w:type="dxa" w:w="1512"/>
           </w:tcPr>
           <w:p>
             <w:r>
@@ -1254,11 +1345,26 @@
             </w:r>
           </w:p>
         </w:tc>
+        <w:tc>
+          <w:tcPr>
+            <w:tcW w:type="dxa" w:w="1512"/>
+          </w:tcPr>
+          <w:p>
+            <w:r>
+              <w:rPr>
+                <w:rFonts w:ascii="宋体" w:hAnsi="宋体" w:eastAsia="宋体"/>
+                <w:b w:val="0"/>
+                <w:sz w:val="19"/>
+              </w:rPr>
+              <w:t>相对低</w:t>
+            </w:r>
+          </w:p>
+        </w:tc>
       </w:tr>
       <w:tr>
         <w:tc>
           <w:tcPr>
-            <w:tcW w:type="dxa" w:w="1814"/>
+            <w:tcW w:type="dxa" w:w="1512"/>
           </w:tcPr>
           <w:p>
             <w:r>
@@ -1273,7 +1379,7 @@
         </w:tc>
         <w:tc>
           <w:tcPr>
-            <w:tcW w:type="dxa" w:w="1814"/>
+            <w:tcW w:type="dxa" w:w="1512"/>
           </w:tcPr>
           <w:p>
             <w:r>
@@ -1288,7 +1394,7 @@
         </w:tc>
         <w:tc>
           <w:tcPr>
-            <w:tcW w:type="dxa" w:w="1814"/>
+            <w:tcW w:type="dxa" w:w="1512"/>
           </w:tcPr>
           <w:p>
             <w:r>
@@ -1303,7 +1409,7 @@
         </w:tc>
         <w:tc>
           <w:tcPr>
-            <w:tcW w:type="dxa" w:w="1814"/>
+            <w:tcW w:type="dxa" w:w="1512"/>
           </w:tcPr>
           <w:p>
             <w:r>
@@ -1318,7 +1424,7 @@
         </w:tc>
         <w:tc>
           <w:tcPr>
-            <w:tcW w:type="dxa" w:w="1814"/>
+            <w:tcW w:type="dxa" w:w="1512"/>
           </w:tcPr>
           <w:p>
             <w:r>
@@ -1331,11 +1437,26 @@
             </w:r>
           </w:p>
         </w:tc>
+        <w:tc>
+          <w:tcPr>
+            <w:tcW w:type="dxa" w:w="1512"/>
+          </w:tcPr>
+          <w:p>
+            <w:r>
+              <w:rPr>
+                <w:rFonts w:ascii="宋体" w:hAnsi="宋体" w:eastAsia="宋体"/>
+                <w:b w:val="0"/>
+                <w:sz w:val="19"/>
+              </w:rPr>
+              <w:t>相对低</w:t>
+            </w:r>
+          </w:p>
+        </w:tc>
       </w:tr>
       <w:tr>
         <w:tc>
           <w:tcPr>
-            <w:tcW w:type="dxa" w:w="1814"/>
+            <w:tcW w:type="dxa" w:w="1512"/>
           </w:tcPr>
           <w:p>
             <w:r>
@@ -1350,7 +1471,7 @@
         </w:tc>
         <w:tc>
           <w:tcPr>
-            <w:tcW w:type="dxa" w:w="1814"/>
+            <w:tcW w:type="dxa" w:w="1512"/>
           </w:tcPr>
           <w:p>
             <w:r>
@@ -1365,7 +1486,7 @@
         </w:tc>
         <w:tc>
           <w:tcPr>
-            <w:tcW w:type="dxa" w:w="1814"/>
+            <w:tcW w:type="dxa" w:w="1512"/>
           </w:tcPr>
           <w:p>
             <w:r>
@@ -1380,7 +1501,7 @@
         </w:tc>
         <w:tc>
           <w:tcPr>
-            <w:tcW w:type="dxa" w:w="1814"/>
+            <w:tcW w:type="dxa" w:w="1512"/>
           </w:tcPr>
           <w:p>
             <w:r>
@@ -1395,7 +1516,7 @@
         </w:tc>
         <w:tc>
           <w:tcPr>
-            <w:tcW w:type="dxa" w:w="1814"/>
+            <w:tcW w:type="dxa" w:w="1512"/>
           </w:tcPr>
           <w:p>
             <w:r>
@@ -1405,6 +1526,21 @@
                 <w:sz w:val="19"/>
               </w:rPr>
               <w:t>较低</w:t>
+            </w:r>
+          </w:p>
+        </w:tc>
+        <w:tc>
+          <w:tcPr>
+            <w:tcW w:type="dxa" w:w="1512"/>
+          </w:tcPr>
+          <w:p>
+            <w:r>
+              <w:rPr>
+                <w:rFonts w:ascii="宋体" w:hAnsi="宋体" w:eastAsia="宋体"/>
+                <w:b w:val="0"/>
+                <w:sz w:val="19"/>
+              </w:rPr>
+              <w:t>相对低</w:t>
             </w:r>
           </w:p>
         </w:tc>
@@ -1620,7 +1756,7 @@
           <w:b/>
           <w:sz w:val="24"/>
         </w:rPr>
-        <w:t>6.2 语义保真度代理</w:t>
+        <w:t>6.2 语义结构完整性代理</w:t>
       </w:r>
     </w:p>
     <w:p>
@@ -1633,7 +1769,7 @@
           <w:b w:val="0"/>
           <w:sz w:val="24"/>
         </w:rPr>
-        <w:t>题面要求将提示词分为主体对象、属性描述、场景关系、风格指令四类。由于附件没有原始提示词，本文用审题可视描述构造代理文本 $T_i$。设四类要素集合分别为 $E_i^s,E_i^a,E_i^r,E_i^g$，语义要素覆盖分为</w:t>
+        <w:t>题面要求将提示词分为主体对象、属性描述、场景关系、风格指令四类。由于附件没有原始提示词，本文不能计算真实 prompt-image 语义保真度，而是用审题可视描述构造代理文本 $T_i$，建立语义结构完整性代理指标。设四类要素集合分别为 $E_i^s,E_i^a,E_i^r,E_i^g$，语义要素覆盖分为</w:t>
       </w:r>
     </w:p>
     <w:p>
@@ -1660,7 +1796,7 @@
           <w:b w:val="0"/>
           <w:sz w:val="24"/>
         </w:rPr>
-        <w:t>该指标只表示代理描述是否覆盖题面要求的语义维度，不代表原始提示词匹配度。</w:t>
+        <w:t>该指标只表示代理描述是否覆盖题面要求的语义维度，不代表原始提示词匹配度，也不等同于 CLIP 语义相似度。</w:t>
       </w:r>
     </w:p>
     <w:p>
@@ -2167,7 +2303,1162 @@
           <w:b/>
           <w:sz w:val="24"/>
         </w:rPr>
-        <w:t>7.4 内容类型敏感性</w:t>
+        <w:t>7.4 绝对等级与相对等级</w:t>
+      </w:r>
+    </w:p>
+    <w:p>
+      <w:pPr>
+        <w:spacing w:line="300" w:lineRule="auto" w:after="0"/>
+      </w:pPr>
+      <w:r>
+        <w:rPr>
+          <w:rFonts w:ascii="宋体" w:hAnsi="宋体" w:eastAsia="宋体"/>
+          <w:b w:val="0"/>
+          <w:sz w:val="24"/>
+        </w:rPr>
+        <w:t>固定阈值绝对等级反映模型分数是否达到预设质量区间；附件内部相对等级用于回应题面“高、中、低质量等级”的比较需求。本文按 `Q_final` 排序，将第 1-2 名定义为相对高，第 3-5 名定义为相对中，第 6-8 名定义为相对低。该相对等级只用于本批附件内部比较，不是专家标签。</w:t>
+      </w:r>
+    </w:p>
+    <w:p>
+      <w:pPr>
+        <w:spacing w:before="60" w:after="60"/>
+        <w:jc w:val="center"/>
+      </w:pPr>
+      <w:r>
+        <w:rPr>
+          <w:rFonts w:ascii="宋体" w:hAnsi="宋体" w:eastAsia="宋体"/>
+          <w:b w:val="0"/>
+          <w:sz w:val="21"/>
+        </w:rPr>
+        <w:t>表 3 附件1相对高/中/低等级与优劣势</w:t>
+      </w:r>
+    </w:p>
+    <w:tbl>
+      <w:tblPr>
+        <w:tblStyle w:val="TableGrid"/>
+        <w:tblW w:type="auto" w:w="0"/>
+        <w:tblLook w:firstColumn="1" w:firstRow="1" w:lastColumn="0" w:lastRow="0" w:noHBand="0" w:noVBand="1" w:val="04A0"/>
+      </w:tblPr>
+      <w:tblGrid>
+        <w:gridCol w:w="1134"/>
+        <w:gridCol w:w="1134"/>
+        <w:gridCol w:w="1134"/>
+        <w:gridCol w:w="1134"/>
+        <w:gridCol w:w="1134"/>
+        <w:gridCol w:w="1134"/>
+        <w:gridCol w:w="1134"/>
+        <w:gridCol w:w="1134"/>
+      </w:tblGrid>
+      <w:tr>
+        <w:tc>
+          <w:tcPr>
+            <w:tcW w:type="dxa" w:w="1134"/>
+          </w:tcPr>
+          <w:p>
+            <w:r>
+              <w:rPr>
+                <w:rFonts w:ascii="宋体" w:hAnsi="宋体" w:eastAsia="宋体"/>
+                <w:b/>
+                <w:sz w:val="19"/>
+              </w:rPr>
+              <w:t>样本ID</w:t>
+            </w:r>
+          </w:p>
+        </w:tc>
+        <w:tc>
+          <w:tcPr>
+            <w:tcW w:type="dxa" w:w="1134"/>
+          </w:tcPr>
+          <w:p>
+            <w:r>
+              <w:rPr>
+                <w:rFonts w:ascii="宋体" w:hAnsi="宋体" w:eastAsia="宋体"/>
+                <w:b/>
+                <w:sz w:val="19"/>
+              </w:rPr>
+              <w:t>文件</w:t>
+            </w:r>
+          </w:p>
+        </w:tc>
+        <w:tc>
+          <w:tcPr>
+            <w:tcW w:type="dxa" w:w="1134"/>
+          </w:tcPr>
+          <w:p>
+            <w:r>
+              <w:rPr>
+                <w:rFonts w:ascii="宋体" w:hAnsi="宋体" w:eastAsia="宋体"/>
+                <w:b/>
+                <w:sz w:val="19"/>
+              </w:rPr>
+              <w:t>类型</w:t>
+            </w:r>
+          </w:p>
+        </w:tc>
+        <w:tc>
+          <w:tcPr>
+            <w:tcW w:type="dxa" w:w="1134"/>
+          </w:tcPr>
+          <w:p>
+            <w:r>
+              <w:rPr>
+                <w:rFonts w:ascii="宋体" w:hAnsi="宋体" w:eastAsia="宋体"/>
+                <w:b/>
+                <w:sz w:val="19"/>
+              </w:rPr>
+              <w:t>最终分</w:t>
+            </w:r>
+          </w:p>
+        </w:tc>
+        <w:tc>
+          <w:tcPr>
+            <w:tcW w:type="dxa" w:w="1134"/>
+          </w:tcPr>
+          <w:p>
+            <w:r>
+              <w:rPr>
+                <w:rFonts w:ascii="宋体" w:hAnsi="宋体" w:eastAsia="宋体"/>
+                <w:b/>
+                <w:sz w:val="19"/>
+              </w:rPr>
+              <w:t>绝对等级</w:t>
+            </w:r>
+          </w:p>
+        </w:tc>
+        <w:tc>
+          <w:tcPr>
+            <w:tcW w:type="dxa" w:w="1134"/>
+          </w:tcPr>
+          <w:p>
+            <w:r>
+              <w:rPr>
+                <w:rFonts w:ascii="宋体" w:hAnsi="宋体" w:eastAsia="宋体"/>
+                <w:b/>
+                <w:sz w:val="19"/>
+              </w:rPr>
+              <w:t>相对等级</w:t>
+            </w:r>
+          </w:p>
+        </w:tc>
+        <w:tc>
+          <w:tcPr>
+            <w:tcW w:type="dxa" w:w="1134"/>
+          </w:tcPr>
+          <w:p>
+            <w:r>
+              <w:rPr>
+                <w:rFonts w:ascii="宋体" w:hAnsi="宋体" w:eastAsia="宋体"/>
+                <w:b/>
+                <w:sz w:val="19"/>
+              </w:rPr>
+              <w:t>关键优势</w:t>
+            </w:r>
+          </w:p>
+        </w:tc>
+        <w:tc>
+          <w:tcPr>
+            <w:tcW w:type="dxa" w:w="1134"/>
+          </w:tcPr>
+          <w:p>
+            <w:r>
+              <w:rPr>
+                <w:rFonts w:ascii="宋体" w:hAnsi="宋体" w:eastAsia="宋体"/>
+                <w:b/>
+                <w:sz w:val="19"/>
+              </w:rPr>
+              <w:t>关键弱点</w:t>
+            </w:r>
+          </w:p>
+        </w:tc>
+      </w:tr>
+      <w:tr>
+        <w:tc>
+          <w:tcPr>
+            <w:tcW w:type="dxa" w:w="1134"/>
+          </w:tcPr>
+          <w:p>
+            <w:r>
+              <w:rPr>
+                <w:rFonts w:ascii="宋体" w:hAnsi="宋体" w:eastAsia="宋体"/>
+                <w:b w:val="0"/>
+                <w:sz w:val="19"/>
+              </w:rPr>
+              <w:t>image_05</w:t>
+            </w:r>
+          </w:p>
+        </w:tc>
+        <w:tc>
+          <w:tcPr>
+            <w:tcW w:type="dxa" w:w="1134"/>
+          </w:tcPr>
+          <w:p>
+            <w:r>
+              <w:rPr>
+                <w:rFonts w:ascii="宋体" w:hAnsi="宋体" w:eastAsia="宋体"/>
+                <w:b w:val="0"/>
+                <w:sz w:val="19"/>
+              </w:rPr>
+              <w:t>5.jpg</w:t>
+            </w:r>
+          </w:p>
+        </w:tc>
+        <w:tc>
+          <w:tcPr>
+            <w:tcW w:type="dxa" w:w="1134"/>
+          </w:tcPr>
+          <w:p>
+            <w:r>
+              <w:rPr>
+                <w:rFonts w:ascii="宋体" w:hAnsi="宋体" w:eastAsia="宋体"/>
+                <w:b w:val="0"/>
+                <w:sz w:val="19"/>
+              </w:rPr>
+              <w:t>写实风景</w:t>
+            </w:r>
+          </w:p>
+        </w:tc>
+        <w:tc>
+          <w:tcPr>
+            <w:tcW w:type="dxa" w:w="1134"/>
+          </w:tcPr>
+          <w:p>
+            <w:r>
+              <w:rPr>
+                <w:rFonts w:ascii="宋体" w:hAnsi="宋体" w:eastAsia="宋体"/>
+                <w:b w:val="0"/>
+                <w:sz w:val="19"/>
+              </w:rPr>
+              <w:t>62.23</w:t>
+            </w:r>
+          </w:p>
+        </w:tc>
+        <w:tc>
+          <w:tcPr>
+            <w:tcW w:type="dxa" w:w="1134"/>
+          </w:tcPr>
+          <w:p>
+            <w:r>
+              <w:rPr>
+                <w:rFonts w:ascii="宋体" w:hAnsi="宋体" w:eastAsia="宋体"/>
+                <w:b w:val="0"/>
+                <w:sz w:val="19"/>
+              </w:rPr>
+              <w:t>中等</w:t>
+            </w:r>
+          </w:p>
+        </w:tc>
+        <w:tc>
+          <w:tcPr>
+            <w:tcW w:type="dxa" w:w="1134"/>
+          </w:tcPr>
+          <w:p>
+            <w:r>
+              <w:rPr>
+                <w:rFonts w:ascii="宋体" w:hAnsi="宋体" w:eastAsia="宋体"/>
+                <w:b w:val="0"/>
+                <w:sz w:val="19"/>
+              </w:rPr>
+              <w:t>相对高</w:t>
+            </w:r>
+          </w:p>
+        </w:tc>
+        <w:tc>
+          <w:tcPr>
+            <w:tcW w:type="dxa" w:w="1134"/>
+          </w:tcPr>
+          <w:p>
+            <w:r>
+              <w:rPr>
+                <w:rFonts w:ascii="宋体" w:hAnsi="宋体" w:eastAsia="宋体"/>
+                <w:b w:val="0"/>
+                <w:sz w:val="19"/>
+              </w:rPr>
+              <w:t>伪影抑制</w:t>
+            </w:r>
+          </w:p>
+        </w:tc>
+        <w:tc>
+          <w:tcPr>
+            <w:tcW w:type="dxa" w:w="1134"/>
+          </w:tcPr>
+          <w:p>
+            <w:r>
+              <w:rPr>
+                <w:rFonts w:ascii="宋体" w:hAnsi="宋体" w:eastAsia="宋体"/>
+                <w:b w:val="0"/>
+                <w:sz w:val="19"/>
+              </w:rPr>
+              <w:t>视觉表达</w:t>
+            </w:r>
+          </w:p>
+        </w:tc>
+      </w:tr>
+      <w:tr>
+        <w:tc>
+          <w:tcPr>
+            <w:tcW w:type="dxa" w:w="1134"/>
+          </w:tcPr>
+          <w:p>
+            <w:r>
+              <w:rPr>
+                <w:rFonts w:ascii="宋体" w:hAnsi="宋体" w:eastAsia="宋体"/>
+                <w:b w:val="0"/>
+                <w:sz w:val="19"/>
+              </w:rPr>
+              <w:t>image_04</w:t>
+            </w:r>
+          </w:p>
+        </w:tc>
+        <w:tc>
+          <w:tcPr>
+            <w:tcW w:type="dxa" w:w="1134"/>
+          </w:tcPr>
+          <w:p>
+            <w:r>
+              <w:rPr>
+                <w:rFonts w:ascii="宋体" w:hAnsi="宋体" w:eastAsia="宋体"/>
+                <w:b w:val="0"/>
+                <w:sz w:val="19"/>
+              </w:rPr>
+              <w:t>4.png</w:t>
+            </w:r>
+          </w:p>
+        </w:tc>
+        <w:tc>
+          <w:tcPr>
+            <w:tcW w:type="dxa" w:w="1134"/>
+          </w:tcPr>
+          <w:p>
+            <w:r>
+              <w:rPr>
+                <w:rFonts w:ascii="宋体" w:hAnsi="宋体" w:eastAsia="宋体"/>
+                <w:b w:val="0"/>
+                <w:sz w:val="19"/>
+              </w:rPr>
+              <w:t>动态街景</w:t>
+            </w:r>
+          </w:p>
+        </w:tc>
+        <w:tc>
+          <w:tcPr>
+            <w:tcW w:type="dxa" w:w="1134"/>
+          </w:tcPr>
+          <w:p>
+            <w:r>
+              <w:rPr>
+                <w:rFonts w:ascii="宋体" w:hAnsi="宋体" w:eastAsia="宋体"/>
+                <w:b w:val="0"/>
+                <w:sz w:val="19"/>
+              </w:rPr>
+              <w:t>59.34</w:t>
+            </w:r>
+          </w:p>
+        </w:tc>
+        <w:tc>
+          <w:tcPr>
+            <w:tcW w:type="dxa" w:w="1134"/>
+          </w:tcPr>
+          <w:p>
+            <w:r>
+              <w:rPr>
+                <w:rFonts w:ascii="宋体" w:hAnsi="宋体" w:eastAsia="宋体"/>
+                <w:b w:val="0"/>
+                <w:sz w:val="19"/>
+              </w:rPr>
+              <w:t>中等</w:t>
+            </w:r>
+          </w:p>
+        </w:tc>
+        <w:tc>
+          <w:tcPr>
+            <w:tcW w:type="dxa" w:w="1134"/>
+          </w:tcPr>
+          <w:p>
+            <w:r>
+              <w:rPr>
+                <w:rFonts w:ascii="宋体" w:hAnsi="宋体" w:eastAsia="宋体"/>
+                <w:b w:val="0"/>
+                <w:sz w:val="19"/>
+              </w:rPr>
+              <w:t>相对高</w:t>
+            </w:r>
+          </w:p>
+        </w:tc>
+        <w:tc>
+          <w:tcPr>
+            <w:tcW w:type="dxa" w:w="1134"/>
+          </w:tcPr>
+          <w:p>
+            <w:r>
+              <w:rPr>
+                <w:rFonts w:ascii="宋体" w:hAnsi="宋体" w:eastAsia="宋体"/>
+                <w:b w:val="0"/>
+                <w:sz w:val="19"/>
+              </w:rPr>
+              <w:t>伪影抑制</w:t>
+            </w:r>
+          </w:p>
+        </w:tc>
+        <w:tc>
+          <w:tcPr>
+            <w:tcW w:type="dxa" w:w="1134"/>
+          </w:tcPr>
+          <w:p>
+            <w:r>
+              <w:rPr>
+                <w:rFonts w:ascii="宋体" w:hAnsi="宋体" w:eastAsia="宋体"/>
+                <w:b w:val="0"/>
+                <w:sz w:val="19"/>
+              </w:rPr>
+              <w:t>结构完整性</w:t>
+            </w:r>
+          </w:p>
+        </w:tc>
+      </w:tr>
+      <w:tr>
+        <w:tc>
+          <w:tcPr>
+            <w:tcW w:type="dxa" w:w="1134"/>
+          </w:tcPr>
+          <w:p>
+            <w:r>
+              <w:rPr>
+                <w:rFonts w:ascii="宋体" w:hAnsi="宋体" w:eastAsia="宋体"/>
+                <w:b w:val="0"/>
+                <w:sz w:val="19"/>
+              </w:rPr>
+              <w:t>image_02</w:t>
+            </w:r>
+          </w:p>
+        </w:tc>
+        <w:tc>
+          <w:tcPr>
+            <w:tcW w:type="dxa" w:w="1134"/>
+          </w:tcPr>
+          <w:p>
+            <w:r>
+              <w:rPr>
+                <w:rFonts w:ascii="宋体" w:hAnsi="宋体" w:eastAsia="宋体"/>
+                <w:b w:val="0"/>
+                <w:sz w:val="19"/>
+              </w:rPr>
+              <w:t>2.png</w:t>
+            </w:r>
+          </w:p>
+        </w:tc>
+        <w:tc>
+          <w:tcPr>
+            <w:tcW w:type="dxa" w:w="1134"/>
+          </w:tcPr>
+          <w:p>
+            <w:r>
+              <w:rPr>
+                <w:rFonts w:ascii="宋体" w:hAnsi="宋体" w:eastAsia="宋体"/>
+                <w:b w:val="0"/>
+                <w:sz w:val="19"/>
+              </w:rPr>
+              <w:t>人物肖像</w:t>
+            </w:r>
+          </w:p>
+        </w:tc>
+        <w:tc>
+          <w:tcPr>
+            <w:tcW w:type="dxa" w:w="1134"/>
+          </w:tcPr>
+          <w:p>
+            <w:r>
+              <w:rPr>
+                <w:rFonts w:ascii="宋体" w:hAnsi="宋体" w:eastAsia="宋体"/>
+                <w:b w:val="0"/>
+                <w:sz w:val="19"/>
+              </w:rPr>
+              <w:t>58.20</w:t>
+            </w:r>
+          </w:p>
+        </w:tc>
+        <w:tc>
+          <w:tcPr>
+            <w:tcW w:type="dxa" w:w="1134"/>
+          </w:tcPr>
+          <w:p>
+            <w:r>
+              <w:rPr>
+                <w:rFonts w:ascii="宋体" w:hAnsi="宋体" w:eastAsia="宋体"/>
+                <w:b w:val="0"/>
+                <w:sz w:val="19"/>
+              </w:rPr>
+              <w:t>中等</w:t>
+            </w:r>
+          </w:p>
+        </w:tc>
+        <w:tc>
+          <w:tcPr>
+            <w:tcW w:type="dxa" w:w="1134"/>
+          </w:tcPr>
+          <w:p>
+            <w:r>
+              <w:rPr>
+                <w:rFonts w:ascii="宋体" w:hAnsi="宋体" w:eastAsia="宋体"/>
+                <w:b w:val="0"/>
+                <w:sz w:val="19"/>
+              </w:rPr>
+              <w:t>相对中</w:t>
+            </w:r>
+          </w:p>
+        </w:tc>
+        <w:tc>
+          <w:tcPr>
+            <w:tcW w:type="dxa" w:w="1134"/>
+          </w:tcPr>
+          <w:p>
+            <w:r>
+              <w:rPr>
+                <w:rFonts w:ascii="宋体" w:hAnsi="宋体" w:eastAsia="宋体"/>
+                <w:b w:val="0"/>
+                <w:sz w:val="19"/>
+              </w:rPr>
+              <w:t>伪影抑制</w:t>
+            </w:r>
+          </w:p>
+        </w:tc>
+        <w:tc>
+          <w:tcPr>
+            <w:tcW w:type="dxa" w:w="1134"/>
+          </w:tcPr>
+          <w:p>
+            <w:r>
+              <w:rPr>
+                <w:rFonts w:ascii="宋体" w:hAnsi="宋体" w:eastAsia="宋体"/>
+                <w:b w:val="0"/>
+                <w:sz w:val="19"/>
+              </w:rPr>
+              <w:t>结构完整性</w:t>
+            </w:r>
+          </w:p>
+        </w:tc>
+      </w:tr>
+      <w:tr>
+        <w:tc>
+          <w:tcPr>
+            <w:tcW w:type="dxa" w:w="1134"/>
+          </w:tcPr>
+          <w:p>
+            <w:r>
+              <w:rPr>
+                <w:rFonts w:ascii="宋体" w:hAnsi="宋体" w:eastAsia="宋体"/>
+                <w:b w:val="0"/>
+                <w:sz w:val="19"/>
+              </w:rPr>
+              <w:t>image_01</w:t>
+            </w:r>
+          </w:p>
+        </w:tc>
+        <w:tc>
+          <w:tcPr>
+            <w:tcW w:type="dxa" w:w="1134"/>
+          </w:tcPr>
+          <w:p>
+            <w:r>
+              <w:rPr>
+                <w:rFonts w:ascii="宋体" w:hAnsi="宋体" w:eastAsia="宋体"/>
+                <w:b w:val="0"/>
+                <w:sz w:val="19"/>
+              </w:rPr>
+              <w:t>1.png</w:t>
+            </w:r>
+          </w:p>
+        </w:tc>
+        <w:tc>
+          <w:tcPr>
+            <w:tcW w:type="dxa" w:w="1134"/>
+          </w:tcPr>
+          <w:p>
+            <w:r>
+              <w:rPr>
+                <w:rFonts w:ascii="宋体" w:hAnsi="宋体" w:eastAsia="宋体"/>
+                <w:b w:val="0"/>
+                <w:sz w:val="19"/>
+              </w:rPr>
+              <w:t>写实风景</w:t>
+            </w:r>
+          </w:p>
+        </w:tc>
+        <w:tc>
+          <w:tcPr>
+            <w:tcW w:type="dxa" w:w="1134"/>
+          </w:tcPr>
+          <w:p>
+            <w:r>
+              <w:rPr>
+                <w:rFonts w:ascii="宋体" w:hAnsi="宋体" w:eastAsia="宋体"/>
+                <w:b w:val="0"/>
+                <w:sz w:val="19"/>
+              </w:rPr>
+              <w:t>57.68</w:t>
+            </w:r>
+          </w:p>
+        </w:tc>
+        <w:tc>
+          <w:tcPr>
+            <w:tcW w:type="dxa" w:w="1134"/>
+          </w:tcPr>
+          <w:p>
+            <w:r>
+              <w:rPr>
+                <w:rFonts w:ascii="宋体" w:hAnsi="宋体" w:eastAsia="宋体"/>
+                <w:b w:val="0"/>
+                <w:sz w:val="19"/>
+              </w:rPr>
+              <w:t>中等</w:t>
+            </w:r>
+          </w:p>
+        </w:tc>
+        <w:tc>
+          <w:tcPr>
+            <w:tcW w:type="dxa" w:w="1134"/>
+          </w:tcPr>
+          <w:p>
+            <w:r>
+              <w:rPr>
+                <w:rFonts w:ascii="宋体" w:hAnsi="宋体" w:eastAsia="宋体"/>
+                <w:b w:val="0"/>
+                <w:sz w:val="19"/>
+              </w:rPr>
+              <w:t>相对中</w:t>
+            </w:r>
+          </w:p>
+        </w:tc>
+        <w:tc>
+          <w:tcPr>
+            <w:tcW w:type="dxa" w:w="1134"/>
+          </w:tcPr>
+          <w:p>
+            <w:r>
+              <w:rPr>
+                <w:rFonts w:ascii="宋体" w:hAnsi="宋体" w:eastAsia="宋体"/>
+                <w:b w:val="0"/>
+                <w:sz w:val="19"/>
+              </w:rPr>
+              <w:t>伪影抑制</w:t>
+            </w:r>
+          </w:p>
+        </w:tc>
+        <w:tc>
+          <w:tcPr>
+            <w:tcW w:type="dxa" w:w="1134"/>
+          </w:tcPr>
+          <w:p>
+            <w:r>
+              <w:rPr>
+                <w:rFonts w:ascii="宋体" w:hAnsi="宋体" w:eastAsia="宋体"/>
+                <w:b w:val="0"/>
+                <w:sz w:val="19"/>
+              </w:rPr>
+              <w:t>视觉表达</w:t>
+            </w:r>
+          </w:p>
+        </w:tc>
+      </w:tr>
+      <w:tr>
+        <w:tc>
+          <w:tcPr>
+            <w:tcW w:type="dxa" w:w="1134"/>
+          </w:tcPr>
+          <w:p>
+            <w:r>
+              <w:rPr>
+                <w:rFonts w:ascii="宋体" w:hAnsi="宋体" w:eastAsia="宋体"/>
+                <w:b w:val="0"/>
+                <w:sz w:val="19"/>
+              </w:rPr>
+              <w:t>image_06</w:t>
+            </w:r>
+          </w:p>
+        </w:tc>
+        <w:tc>
+          <w:tcPr>
+            <w:tcW w:type="dxa" w:w="1134"/>
+          </w:tcPr>
+          <w:p>
+            <w:r>
+              <w:rPr>
+                <w:rFonts w:ascii="宋体" w:hAnsi="宋体" w:eastAsia="宋体"/>
+                <w:b w:val="0"/>
+                <w:sz w:val="19"/>
+              </w:rPr>
+              <w:t>6.jpg</w:t>
+            </w:r>
+          </w:p>
+        </w:tc>
+        <w:tc>
+          <w:tcPr>
+            <w:tcW w:type="dxa" w:w="1134"/>
+          </w:tcPr>
+          <w:p>
+            <w:r>
+              <w:rPr>
+                <w:rFonts w:ascii="宋体" w:hAnsi="宋体" w:eastAsia="宋体"/>
+                <w:b w:val="0"/>
+                <w:sz w:val="19"/>
+              </w:rPr>
+              <w:t>人物插画</w:t>
+            </w:r>
+          </w:p>
+        </w:tc>
+        <w:tc>
+          <w:tcPr>
+            <w:tcW w:type="dxa" w:w="1134"/>
+          </w:tcPr>
+          <w:p>
+            <w:r>
+              <w:rPr>
+                <w:rFonts w:ascii="宋体" w:hAnsi="宋体" w:eastAsia="宋体"/>
+                <w:b w:val="0"/>
+                <w:sz w:val="19"/>
+              </w:rPr>
+              <w:t>55.22</w:t>
+            </w:r>
+          </w:p>
+        </w:tc>
+        <w:tc>
+          <w:tcPr>
+            <w:tcW w:type="dxa" w:w="1134"/>
+          </w:tcPr>
+          <w:p>
+            <w:r>
+              <w:rPr>
+                <w:rFonts w:ascii="宋体" w:hAnsi="宋体" w:eastAsia="宋体"/>
+                <w:b w:val="0"/>
+                <w:sz w:val="19"/>
+              </w:rPr>
+              <w:t>中等</w:t>
+            </w:r>
+          </w:p>
+        </w:tc>
+        <w:tc>
+          <w:tcPr>
+            <w:tcW w:type="dxa" w:w="1134"/>
+          </w:tcPr>
+          <w:p>
+            <w:r>
+              <w:rPr>
+                <w:rFonts w:ascii="宋体" w:hAnsi="宋体" w:eastAsia="宋体"/>
+                <w:b w:val="0"/>
+                <w:sz w:val="19"/>
+              </w:rPr>
+              <w:t>相对中</w:t>
+            </w:r>
+          </w:p>
+        </w:tc>
+        <w:tc>
+          <w:tcPr>
+            <w:tcW w:type="dxa" w:w="1134"/>
+          </w:tcPr>
+          <w:p>
+            <w:r>
+              <w:rPr>
+                <w:rFonts w:ascii="宋体" w:hAnsi="宋体" w:eastAsia="宋体"/>
+                <w:b w:val="0"/>
+                <w:sz w:val="19"/>
+              </w:rPr>
+              <w:t>伪影抑制</w:t>
+            </w:r>
+          </w:p>
+        </w:tc>
+        <w:tc>
+          <w:tcPr>
+            <w:tcW w:type="dxa" w:w="1134"/>
+          </w:tcPr>
+          <w:p>
+            <w:r>
+              <w:rPr>
+                <w:rFonts w:ascii="宋体" w:hAnsi="宋体" w:eastAsia="宋体"/>
+                <w:b w:val="0"/>
+                <w:sz w:val="19"/>
+              </w:rPr>
+              <w:t>视觉表达</w:t>
+            </w:r>
+          </w:p>
+        </w:tc>
+      </w:tr>
+      <w:tr>
+        <w:tc>
+          <w:tcPr>
+            <w:tcW w:type="dxa" w:w="1134"/>
+          </w:tcPr>
+          <w:p>
+            <w:r>
+              <w:rPr>
+                <w:rFonts w:ascii="宋体" w:hAnsi="宋体" w:eastAsia="宋体"/>
+                <w:b w:val="0"/>
+                <w:sz w:val="19"/>
+              </w:rPr>
+              <w:t>image_08</w:t>
+            </w:r>
+          </w:p>
+        </w:tc>
+        <w:tc>
+          <w:tcPr>
+            <w:tcW w:type="dxa" w:w="1134"/>
+          </w:tcPr>
+          <w:p>
+            <w:r>
+              <w:rPr>
+                <w:rFonts w:ascii="宋体" w:hAnsi="宋体" w:eastAsia="宋体"/>
+                <w:b w:val="0"/>
+                <w:sz w:val="19"/>
+              </w:rPr>
+              <w:t>8.jpg</w:t>
+            </w:r>
+          </w:p>
+        </w:tc>
+        <w:tc>
+          <w:tcPr>
+            <w:tcW w:type="dxa" w:w="1134"/>
+          </w:tcPr>
+          <w:p>
+            <w:r>
+              <w:rPr>
+                <w:rFonts w:ascii="宋体" w:hAnsi="宋体" w:eastAsia="宋体"/>
+                <w:b w:val="0"/>
+                <w:sz w:val="19"/>
+              </w:rPr>
+              <w:t>像素街景</w:t>
+            </w:r>
+          </w:p>
+        </w:tc>
+        <w:tc>
+          <w:tcPr>
+            <w:tcW w:type="dxa" w:w="1134"/>
+          </w:tcPr>
+          <w:p>
+            <w:r>
+              <w:rPr>
+                <w:rFonts w:ascii="宋体" w:hAnsi="宋体" w:eastAsia="宋体"/>
+                <w:b w:val="0"/>
+                <w:sz w:val="19"/>
+              </w:rPr>
+              <w:t>53.41</w:t>
+            </w:r>
+          </w:p>
+        </w:tc>
+        <w:tc>
+          <w:tcPr>
+            <w:tcW w:type="dxa" w:w="1134"/>
+          </w:tcPr>
+          <w:p>
+            <w:r>
+              <w:rPr>
+                <w:rFonts w:ascii="宋体" w:hAnsi="宋体" w:eastAsia="宋体"/>
+                <w:b w:val="0"/>
+                <w:sz w:val="19"/>
+              </w:rPr>
+              <w:t>较低</w:t>
+            </w:r>
+          </w:p>
+        </w:tc>
+        <w:tc>
+          <w:tcPr>
+            <w:tcW w:type="dxa" w:w="1134"/>
+          </w:tcPr>
+          <w:p>
+            <w:r>
+              <w:rPr>
+                <w:rFonts w:ascii="宋体" w:hAnsi="宋体" w:eastAsia="宋体"/>
+                <w:b w:val="0"/>
+                <w:sz w:val="19"/>
+              </w:rPr>
+              <w:t>相对低</w:t>
+            </w:r>
+          </w:p>
+        </w:tc>
+        <w:tc>
+          <w:tcPr>
+            <w:tcW w:type="dxa" w:w="1134"/>
+          </w:tcPr>
+          <w:p>
+            <w:r>
+              <w:rPr>
+                <w:rFonts w:ascii="宋体" w:hAnsi="宋体" w:eastAsia="宋体"/>
+                <w:b w:val="0"/>
+                <w:sz w:val="19"/>
+              </w:rPr>
+              <w:t>伪影抑制</w:t>
+            </w:r>
+          </w:p>
+        </w:tc>
+        <w:tc>
+          <w:tcPr>
+            <w:tcW w:type="dxa" w:w="1134"/>
+          </w:tcPr>
+          <w:p>
+            <w:r>
+              <w:rPr>
+                <w:rFonts w:ascii="宋体" w:hAnsi="宋体" w:eastAsia="宋体"/>
+                <w:b w:val="0"/>
+                <w:sz w:val="19"/>
+              </w:rPr>
+              <w:t>语义结构完整性代理</w:t>
+            </w:r>
+          </w:p>
+        </w:tc>
+      </w:tr>
+      <w:tr>
+        <w:tc>
+          <w:tcPr>
+            <w:tcW w:type="dxa" w:w="1134"/>
+          </w:tcPr>
+          <w:p>
+            <w:r>
+              <w:rPr>
+                <w:rFonts w:ascii="宋体" w:hAnsi="宋体" w:eastAsia="宋体"/>
+                <w:b w:val="0"/>
+                <w:sz w:val="19"/>
+              </w:rPr>
+              <w:t>image_07</w:t>
+            </w:r>
+          </w:p>
+        </w:tc>
+        <w:tc>
+          <w:tcPr>
+            <w:tcW w:type="dxa" w:w="1134"/>
+          </w:tcPr>
+          <w:p>
+            <w:r>
+              <w:rPr>
+                <w:rFonts w:ascii="宋体" w:hAnsi="宋体" w:eastAsia="宋体"/>
+                <w:b w:val="0"/>
+                <w:sz w:val="19"/>
+              </w:rPr>
+              <w:t>7.jpg</w:t>
+            </w:r>
+          </w:p>
+        </w:tc>
+        <w:tc>
+          <w:tcPr>
+            <w:tcW w:type="dxa" w:w="1134"/>
+          </w:tcPr>
+          <w:p>
+            <w:r>
+              <w:rPr>
+                <w:rFonts w:ascii="宋体" w:hAnsi="宋体" w:eastAsia="宋体"/>
+                <w:b w:val="0"/>
+                <w:sz w:val="19"/>
+              </w:rPr>
+              <w:t>水墨插画</w:t>
+            </w:r>
+          </w:p>
+        </w:tc>
+        <w:tc>
+          <w:tcPr>
+            <w:tcW w:type="dxa" w:w="1134"/>
+          </w:tcPr>
+          <w:p>
+            <w:r>
+              <w:rPr>
+                <w:rFonts w:ascii="宋体" w:hAnsi="宋体" w:eastAsia="宋体"/>
+                <w:b w:val="0"/>
+                <w:sz w:val="19"/>
+              </w:rPr>
+              <w:t>52.50</w:t>
+            </w:r>
+          </w:p>
+        </w:tc>
+        <w:tc>
+          <w:tcPr>
+            <w:tcW w:type="dxa" w:w="1134"/>
+          </w:tcPr>
+          <w:p>
+            <w:r>
+              <w:rPr>
+                <w:rFonts w:ascii="宋体" w:hAnsi="宋体" w:eastAsia="宋体"/>
+                <w:b w:val="0"/>
+                <w:sz w:val="19"/>
+              </w:rPr>
+              <w:t>较低</w:t>
+            </w:r>
+          </w:p>
+        </w:tc>
+        <w:tc>
+          <w:tcPr>
+            <w:tcW w:type="dxa" w:w="1134"/>
+          </w:tcPr>
+          <w:p>
+            <w:r>
+              <w:rPr>
+                <w:rFonts w:ascii="宋体" w:hAnsi="宋体" w:eastAsia="宋体"/>
+                <w:b w:val="0"/>
+                <w:sz w:val="19"/>
+              </w:rPr>
+              <w:t>相对低</w:t>
+            </w:r>
+          </w:p>
+        </w:tc>
+        <w:tc>
+          <w:tcPr>
+            <w:tcW w:type="dxa" w:w="1134"/>
+          </w:tcPr>
+          <w:p>
+            <w:r>
+              <w:rPr>
+                <w:rFonts w:ascii="宋体" w:hAnsi="宋体" w:eastAsia="宋体"/>
+                <w:b w:val="0"/>
+                <w:sz w:val="19"/>
+              </w:rPr>
+              <w:t>伪影抑制</w:t>
+            </w:r>
+          </w:p>
+        </w:tc>
+        <w:tc>
+          <w:tcPr>
+            <w:tcW w:type="dxa" w:w="1134"/>
+          </w:tcPr>
+          <w:p>
+            <w:r>
+              <w:rPr>
+                <w:rFonts w:ascii="宋体" w:hAnsi="宋体" w:eastAsia="宋体"/>
+                <w:b w:val="0"/>
+                <w:sz w:val="19"/>
+              </w:rPr>
+              <w:t>视觉表达</w:t>
+            </w:r>
+          </w:p>
+        </w:tc>
+      </w:tr>
+      <w:tr>
+        <w:tc>
+          <w:tcPr>
+            <w:tcW w:type="dxa" w:w="1134"/>
+          </w:tcPr>
+          <w:p>
+            <w:r>
+              <w:rPr>
+                <w:rFonts w:ascii="宋体" w:hAnsi="宋体" w:eastAsia="宋体"/>
+                <w:b w:val="0"/>
+                <w:sz w:val="19"/>
+              </w:rPr>
+              <w:t>image_03</w:t>
+            </w:r>
+          </w:p>
+        </w:tc>
+        <w:tc>
+          <w:tcPr>
+            <w:tcW w:type="dxa" w:w="1134"/>
+          </w:tcPr>
+          <w:p>
+            <w:r>
+              <w:rPr>
+                <w:rFonts w:ascii="宋体" w:hAnsi="宋体" w:eastAsia="宋体"/>
+                <w:b w:val="0"/>
+                <w:sz w:val="19"/>
+              </w:rPr>
+              <w:t>3.png</w:t>
+            </w:r>
+          </w:p>
+        </w:tc>
+        <w:tc>
+          <w:tcPr>
+            <w:tcW w:type="dxa" w:w="1134"/>
+          </w:tcPr>
+          <w:p>
+            <w:r>
+              <w:rPr>
+                <w:rFonts w:ascii="宋体" w:hAnsi="宋体" w:eastAsia="宋体"/>
+                <w:b w:val="0"/>
+                <w:sz w:val="19"/>
+              </w:rPr>
+              <w:t>艺术插画</w:t>
+            </w:r>
+          </w:p>
+        </w:tc>
+        <w:tc>
+          <w:tcPr>
+            <w:tcW w:type="dxa" w:w="1134"/>
+          </w:tcPr>
+          <w:p>
+            <w:r>
+              <w:rPr>
+                <w:rFonts w:ascii="宋体" w:hAnsi="宋体" w:eastAsia="宋体"/>
+                <w:b w:val="0"/>
+                <w:sz w:val="19"/>
+              </w:rPr>
+              <w:t>42.41</w:t>
+            </w:r>
+          </w:p>
+        </w:tc>
+        <w:tc>
+          <w:tcPr>
+            <w:tcW w:type="dxa" w:w="1134"/>
+          </w:tcPr>
+          <w:p>
+            <w:r>
+              <w:rPr>
+                <w:rFonts w:ascii="宋体" w:hAnsi="宋体" w:eastAsia="宋体"/>
+                <w:b w:val="0"/>
+                <w:sz w:val="19"/>
+              </w:rPr>
+              <w:t>较低</w:t>
+            </w:r>
+          </w:p>
+        </w:tc>
+        <w:tc>
+          <w:tcPr>
+            <w:tcW w:type="dxa" w:w="1134"/>
+          </w:tcPr>
+          <w:p>
+            <w:r>
+              <w:rPr>
+                <w:rFonts w:ascii="宋体" w:hAnsi="宋体" w:eastAsia="宋体"/>
+                <w:b w:val="0"/>
+                <w:sz w:val="19"/>
+              </w:rPr>
+              <w:t>相对低</w:t>
+            </w:r>
+          </w:p>
+        </w:tc>
+        <w:tc>
+          <w:tcPr>
+            <w:tcW w:type="dxa" w:w="1134"/>
+          </w:tcPr>
+          <w:p>
+            <w:r>
+              <w:rPr>
+                <w:rFonts w:ascii="宋体" w:hAnsi="宋体" w:eastAsia="宋体"/>
+                <w:b w:val="0"/>
+                <w:sz w:val="19"/>
+              </w:rPr>
+              <w:t>伪影抑制</w:t>
+            </w:r>
+          </w:p>
+        </w:tc>
+        <w:tc>
+          <w:tcPr>
+            <w:tcW w:type="dxa" w:w="1134"/>
+          </w:tcPr>
+          <w:p>
+            <w:r>
+              <w:rPr>
+                <w:rFonts w:ascii="宋体" w:hAnsi="宋体" w:eastAsia="宋体"/>
+                <w:b w:val="0"/>
+                <w:sz w:val="19"/>
+              </w:rPr>
+              <w:t>结构完整性</w:t>
+            </w:r>
+          </w:p>
+        </w:tc>
+      </w:tr>
+    </w:tbl>
+    <w:p>
+      <w:pPr>
+        <w:jc w:val="left"/>
+      </w:pPr>
+      <w:r>
+        <w:rPr>
+          <w:rFonts w:ascii="黑体" w:hAnsi="黑体" w:eastAsia="黑体"/>
+          <w:b/>
+          <w:sz w:val="24"/>
+        </w:rPr>
+        <w:t>7.5 内容类型敏感性</w:t>
       </w:r>
     </w:p>
     <w:p>
@@ -2657,7 +3948,7 @@
           <w:b w:val="0"/>
           <w:sz w:val="24"/>
         </w:rPr>
-        <w:t>不足：缺少原始提示词、专家评分和真实生成参数，语义保真度和等级校准只能使用代理；没有训练式目标检测器时，车流视频中的车辆数量和身份一致性只能由光流与颜色统计间接描述。</w:t>
+        <w:t>不足：缺少原始提示词、专家评分和真实生成参数，语义结构完整性和等级校准只能使用代理；附件 1 仅含 8 张图像，组合赋权和相对分级主要用于本批样本内部比较，外推到更大规模 AIGC 图像集时需要重新校准权重和等级阈值；没有训练式目标检测器时，车流视频中的车辆数量和身份一致性只能由光流与颜色统计间接描述。</w:t>
       </w:r>
     </w:p>
     <w:p>

</xml_diff>